<commit_message>
DOCX textual regenerado da versao anonimizada (removida a ponta solta com nomes no cabecalho)
Co-Authored-By: Claude Fable 5 <noreply@anthropic.com>
</commit_message>
<xml_diff>
--- a/docs/RELATORIO_FINAL.docx
+++ b/docs/RELATORIO_FINAL.docx
@@ -62,33 +62,6 @@
     </w:p>
     <w:p>
       <w:pPr>
-        <w:spacing w:after="40"/>
-        <w:jc w:val="center"/>
-      </w:pPr>
-      <w:r>
-        <w:t>Equipe: Marcelo e Caio · Orientação: Profa. Nadia Cardoso Moreira</w:t>
-      </w:r>
-    </w:p>
-    <w:p>
-      <w:pPr>
-        <w:spacing w:after="40"/>
-        <w:jc w:val="center"/>
-      </w:pPr>
-      <w:r>
-        <w:t>Repositório com código, dados e replicação completa:</w:t>
-      </w:r>
-    </w:p>
-    <w:p>
-      <w:pPr>
-        <w:spacing w:after="40"/>
-        <w:jc w:val="center"/>
-      </w:pPr>
-      <w:r>
-        <w:t>https://github.com/marceleann/Caio-e-Marcelo-e-Vinicius</w:t>
-      </w:r>
-    </w:p>
-    <w:p>
-      <w:pPr>
         <w:ind w:left="454" w:right="283"/>
       </w:pPr>
       <w:r>
@@ -121,7 +94,7 @@
     </w:p>
     <w:p>
       <w:r>
-        <w:t>Na implementação, a carteira que compra mensalmente as 10 empresas de maior TD rendeu +20,4% ao ano contra +13,2% do S&amp;P 500 em 199 meses (fev/2009 a ago/2025). O relatório também documenta o que não funcionou: a hipótese de que o sinal prevê volatilidade futura caiu nos testes de robustez e foi descartada, decisão detalhada por evidenciar o rigor do processo. Todos os resultados se reproduzem do repositório público com quatro comandos.</w:t>
+        <w:t>Na implementação, a carteira que compra mensalmente as 10 empresas de maior TD rendeu +20,4% ao ano contra +13,2% do S&amp;P 500 em 199 meses (fev/2009 a ago/2025). O relatório também documenta o que não funcionou: a hipótese de que o sinal prevê volatilidade futura caiu nos testes de robustez e foi descartada, decisão detalhada por evidenciar o rigor do processo. Todos os resultados se reproduzem do repositório do projeto com quatro comandos (código e dados à disposição da banca mediante solicitação).</w:t>
       </w:r>
     </w:p>
     <w:p>
@@ -260,7 +233,7 @@
     </w:p>
     <w:p>
       <w:r>
-        <w:t>Na implementação, dois backtests independentes, ambos com custos e com auditoria, nos próprios scripts, de que nenhuma informação futura entra na seleção. O primeiro compra, ao fim de cada mês, as 10 empresas de maior TD em pesos iguais (call mais recente dos três meses anteriores), carrega por um mês e rebalanceia, a 10 pontos-base por lado sobre o giro. O segundo é um long-short por quintis calendar-time com especificação congelada antes da execução (entrada no pregão seguinte à call, 63 pregões de manutenção, custos de 5 pontos-base por perna, 2006 a 2025). Todos os números saem de scripts versionados; a replicação exige quatro comandos e foi testada em clone limpo, com resultados idênticos.</w:t>
+        <w:t>Na implementação, dois backtests independentes, ambos com custos e com auditoria, nos próprios scripts, de que nenhuma informação futura entra na seleção. O primeiro compra, ao fim de cada mês, as 10 empresas de maior TD em pesos iguais (call mais recente dos três meses anteriores), carrega por um mês e rebalanceia, a 10 pontos-base por lado sobre o giro. O segundo é um long-short por quintis calendar-time com especificação congelada antes da execução (entrada no pregão seguinte à call, 63 pregões de manutenção, custos de 5 pontos-base por perna, 2006 a 2025). As defesas contra vieses são explícitas: contra look-ahead, a auditoria automática de datas e o alinhamento de fundamentos pela data de protocolo; contra overfitting, a especificação congelada antes da execução, o período completo sem seleção e a contagem de todas as tentativas para ajuste de múltiplos testes; contra sobrevivência, o universo com as empresas que saíram do índice. Todos os números saem de scripts versionados; a replicação exige quatro comandos e foi testada em clone limpo, com resultados idênticos.</w:t>
       </w:r>
     </w:p>
     <w:p>
@@ -1249,7 +1222,7 @@
     </w:p>
     <w:p>
       <w:r>
-        <w:t>A leitura é feita em duas camadas. Contra o S&amp;P 500, o excesso é de +7,1% ao ano (t=2,60), com vitória em 58% dos meses e em 11 dos 17 anos. Como carteiras de pesos iguais tendem a superar índices ponderados por valor, construiu-se a régua mais exigente, o próprio universo elegível em pesos iguais: contra ela, a seleção por TD adiciona +3,6% ao ano (t=1,59), positiva em todos os subperíodos (+1,8% de 2010 em diante; +2,6% de 2019 em diante), embora sem significância isolada, consequência esperada de concentrar em 10 ativos, nos quais o ruído específico domina. A carteira espelho (menor TD) rende 5,1 pontos menos ao ano. Quanto a cenários, o top-10 destaca-se em anos de estresse ou recuperação (fechou 2018 em +0,4% contra −6,2% do índice e caiu menos em 2022, −14,1% contra −19,4%) e fica para trás em altas amplas como 2016 e 2021. O giro médio é de 35% ao mês e as composições são verificáveis no repositório.</w:t>
+        <w:t>A leitura é feita em duas camadas. Contra o S&amp;P 500, o excesso é de +7,1% ao ano (t=2,60), com vitória em 58% dos meses e em 11 dos 17 anos. Como carteiras de pesos iguais tendem a superar índices ponderados por valor, construiu-se a régua mais exigente, o próprio universo elegível em pesos iguais: contra ela, a seleção por TD adiciona +3,6% ao ano (t=1,59), positiva em todos os subperíodos (+1,8% de 2010 em diante; +2,6% de 2019 em diante), embora sem significância isolada, consequência esperada de concentrar em 10 ativos, nos quais o ruído específico domina. A carteira espelho (menor TD) rende 5,1 pontos menos ao ano. Quanto a cenários, o top-10 destaca-se em anos de estresse ou recuperação (fechou 2018 em +0,4% contra −6,2% do índice e caiu menos em 2022, −14,1% contra −19,4%) e fica para trás em altas amplas como 2016 e 2021. O giro médio é de 35% ao mês e as composições mês a mês são verificáveis no repositório do projeto.</w:t>
       </w:r>
     </w:p>
     <w:p>
@@ -1364,7 +1337,7 @@
     </w:p>
     <w:p>
       <w:r>
-        <w:t>Todos os números deste relatório saem de scripts versionados no repositório, foram reproduzidos em clone limpo e revalidados na data da entrega. Nenhum número foi digitado à mão.</w:t>
+        <w:t>Todos os números deste relatório saem de scripts versionados, foram reproduzidos em clone limpo e revalidados na data da entrega. Nenhum número foi digitado à mão. Código, dados e documentação completa ficam à disposição da banca mediante solicitação.</w:t>
       </w:r>
     </w:p>
     <w:sectPr>

</xml_diff>

<commit_message>
Revisao de clareza e persuasao ao longo do texto (sem topico dedicado): frames de venda ancorados nos numeros validados (triplo do acumulado, defesa em 2018/2022, sinal rapido e dificil de copiar, descarte da H2 como credencial), frases encurtadas; 5 paginas mantidas, anonimato e forma conferidos
Co-Authored-By: Claude Fable 5 <noreply@anthropic.com>
</commit_message>
<xml_diff>
--- a/docs/RELATORIO_FINAL.docx
+++ b/docs/RELATORIO_FINAL.docx
@@ -89,12 +89,12 @@
     </w:p>
     <w:p>
       <w:r>
-        <w:t>Este relatório apresenta a construção e a validação de um sinal quantitativo extraído das teleconferências de resultados: a divergência de tom entre os executivos de uma mesma empresa, medida pela Tone Distance (TD). Foram processadas 33.362 transcrições de 685 empresas do S&amp;P 500 (2005 a 2025), e os testes em painel confirmam a tese: empresas cujos gestores divergem mais sofrem retorno anormal menor no anúncio (t até −2,8), rendem mais nos três meses seguintes (t=+2,0) e entregam surpresas de lucro mais imprevisíveis no trimestre posterior (t=+3,58 fora da amostra, o resultado preditivo mais forte). O quadro se repete em dois medidores de tom independentes, o que afasta artefato de instrumento.</w:t>
+        <w:t>Este relatório apresenta um sinal de investimento que quase ninguém está olhando: a divergência de tom entre os executivos de uma mesma empresa, medida pela Tone Distance (TD). A ideia é simples de enunciar e difícil de copiar. Processamos 33.362 transcrições de 685 empresas do S&amp;P 500 (2005 a 2025) e mostramos que, quando os gestores de uma call desafinam entre si, o mercado reage: a ação sofre no anúncio (t até −2,8), rende mais nos três meses seguintes (t=+2,0) e entrega surpresa de lucro maior no trimestre posterior (t=+3,58 fora da amostra, com 71% de acerto). Poucos sinais sobrevivem, como este sobreviveu, à troca completa do instrumento de medida: todo o quadro se repete em dois medidores de tom independentes.</w:t>
       </w:r>
     </w:p>
     <w:p>
       <w:r>
-        <w:t>Na implementação, a carteira que compra mensalmente as 10 empresas de maior TD rendeu +20,4% ao ano contra +13,2% do S&amp;P 500 em 199 meses (fev/2009 a ago/2025). O relatório também documenta o que não funcionou: a hipótese de que o sinal prevê volatilidade futura caiu nos testes de robustez e foi descartada, decisão detalhada por evidenciar o rigor do processo. Todos os resultados se reproduzem do repositório do projeto com quatro comandos (código e dados à disposição da banca mediante solicitação).</w:t>
+        <w:t>O resultado prático é direto. A carteira que compra mensalmente as 10 empresas de maior TD rendeu +20,4% ao ano contra +13,2% do S&amp;P 500 em 199 meses (fev/2009 a ago/2025): quase o triplo do retorno acumulado do índice, ganhando inclusive nos dois piores anos do período. E o relatório mostra também o que reprovou: a hipótese de prever volatilidade caiu na validação temporal e foi descartada, o que diz muito sobre o rigor com que as outras duas foram aprovadas. Tudo se reproduz do repositório do projeto com quatro comandos (código e dados à disposição da banca mediante solicitação).</w:t>
       </w:r>
     </w:p>
     <w:p>
@@ -107,7 +107,7 @@
     </w:p>
     <w:p>
       <w:r>
-        <w:t>Quem acompanha earnings calls conhece a cena: o CEO abre com a mensagem preparada e, no Q&amp;A, cada executivo responde com o tom que consegue sustentar ao vivo. O texto é coordenado; o tom, nem sempre. A premissa do trabalho é que esse descompasso carrega informação: um CFO visivelmente mais cauteloso que o CEO na mesma call sinaliza desacordo interno ou incerteza que nenhum press release admitiria. Daí as duas perguntas da pesquisa: é possível medir essa divergência de forma sistemática? E, medida, ela tem valor econômico?</w:t>
+        <w:t>Quem acompanha earnings calls conhece a cena: o CEO abre com a mensagem preparada e, no Q&amp;A, cada executivo responde com o tom que consegue sustentar ao vivo. O texto é coordenado; o tom, nem sempre. E é aí que mora a oportunidade: um CFO visivelmente mais cauteloso que o CEO na mesma call revela desacordo interno ou incerteza que nenhum press release admitiria. Enquanto o mercado inteiro lê o que a empresa diz, o CORO mede o que a empresa deixa escapar. Daí as duas perguntas da pesquisa: é possível medir essa divergência de forma sistemática? E, medida, ela tem valor econômico?</w:t>
       </w:r>
     </w:p>
     <w:p>
@@ -144,7 +144,7 @@
     </w:p>
     <w:p>
       <w:r>
-        <w:t>O CORO é a resposta prática: lê a transcrição de cada call, atribui cada fala ao seu orador, mede o tom de cada gestor e resume o desalinhamento em um escore por empresa-trimestre, pronto minutos após a publicação da transcrição. Para a mesa, é insumo no mesmo dia do evento: sinal de seleção, condicionante de exposição a anúncios e termômetro de incerteza. A identidade visual traduz o mecanismo: o robô ouvinte, de fones, diante de vozes que chegam alinhadas e uma que desafina.</w:t>
+        <w:t>O CORO é a resposta prática: lê a transcrição de cada call, atribui cada fala ao seu orador, mede o tom de cada gestor e resume o desalinhamento em um escore por empresa-trimestre, pronto minutos após a publicação da transcrição. Essa velocidade importa: o prêmio do sinal se realiza ao longo de meses, então quem o calcula no dia do evento chega antes. Para a mesa, é insumo imediato: sinal de seleção, condicionante de exposição a anúncios e termômetro de incerteza. A identidade visual traduz o mecanismo: o robô ouvinte, de fones, diante de vozes que chegam alinhadas e uma que desafina.</w:t>
       </w:r>
     </w:p>
     <w:p>
@@ -197,7 +197,7 @@
     </w:p>
     <w:p>
       <w:r>
-        <w:t>A literatura de finanças textuais estabelece que o tom da comunicação corporativa move preços: Loughran e McDonald (2011) construíram o dicionário de tom para finanças; Huang, Teoh e Zhang (2014) mostraram que gestores administram o tom e que o mercado reage ao seu componente anormal; Lee (2016) documentou que investidores penalizam executivos presos a roteiros. A medida deste trabalho vem de Angelo, Johnston, Singh e Wan (2025), que deslocam a pergunta do tom médio para a divergência entre os executivos da mesma call, a Tone Distance. Partindo dessa referência, realizamos um teste independente, com universo, dados e código próprios, e uma extensão deliberada: toda a análise foi refeita trocando o medidor de tom pelo FinBERT (Yang, Uy e Huang, 2020), modelo neural que classifica cada sentença pelo contexto. A troca é a contraprova do instrumento: fenômeno real aparece nos dois medidores.</w:t>
+        <w:t>A literatura de finanças textuais já estabeleceu que o tom da comunicação corporativa move preços: Loughran e McDonald (2011) construíram o dicionário de tom para finanças; Huang, Teoh e Zhang (2014) mostraram que gestores administram o tom e que o mercado reage ao seu componente anormal; Lee (2016) documentou que investidores penalizam executivos presos a roteiros. A medida deste trabalho vem de Angelo, Johnston, Singh e Wan (2025), que deslocam a pergunta do tom médio, já muito explorado, para um território quase intocado: a divergência entre os executivos da mesma call, a Tone Distance. Partindo dessa referência, fizemos o que diferencia replicação de convicção: um teste independente, com universo, dados e código próprios, e toda a análise refeita trocando o medidor de tom pelo FinBERT (Yang, Uy e Huang, 2020), modelo neural que classifica cada sentença pelo contexto. A troca é a contraprova do instrumento: fenômeno real aparece nos dois medidores, e este apareceu.</w:t>
       </w:r>
     </w:p>
     <w:p>
@@ -215,7 +215,7 @@
     </w:p>
     <w:p>
       <w:r>
-        <w:t>O cálculo do sinal tem três passos: cada gestor i vira um vetor g(i) = (p(i), n(i)) com as frações de linguagem positiva e negativa da sua fala; calcula-se o centro c da call; e a TD é a média das distâncias euclidianas ao centro, TD = (1/N) Σ ‖g(i) − c‖, exigindo ao menos dois gestores. A definição do centro rendeu a principal contribuição metodológica. Na média simples cada orador pesa igual, e numa call da Apple de 2020 um orador de 283 palavras, cujas únicas 6 negativas eram o aviso legal padrão, respondia por um terço do sinal. O tom agregado (cada palavra pesa igual) corrige a contaminação, e a ponderação pelo volume de fala leva a correção ao limite; a Seção 5 mostra que o sinal enfraquece conforme se devolve peso a oradores marginais. A implementação foi verificada por reimplementação independente nas 32.387 calls elegíveis (diferença máxima da ordem de 10⁻¹⁶).</w:t>
+        <w:t>O cálculo do sinal tem três passos: cada gestor i vira um vetor g(i) = (p(i), n(i)) com as frações de linguagem positiva e negativa da sua fala; calcula-se o centro c da call; e a TD é a média das distâncias euclidianas ao centro, TD = (1/N) Σ ‖g(i) − c‖, exigindo ao menos dois gestores. Foi na definição desse centro que o trabalho produziu sua contribuição mais valiosa, e ela é uma barreira de entrada: medir isso bem não é trivial. Na média simples cada orador pesa igual, e numa call da Apple de 2020 um orador de 283 palavras, cujas únicas 6 negativas eram o aviso legal padrão, respondia por um terço do sinal. O tom agregado (cada palavra pesa igual) corrige a contaminação, e a ponderação pelo volume de fala leva a correção ao limite; a Seção 5 mostra que o sinal enfraquece conforme se devolve peso a oradores marginais. Quem medir do jeito errado não encontra nada, e é provavelmente por isso que o sinal segue vivo. A implementação foi verificada por reimplementação independente nas 32.387 calls elegíveis (diferença máxima da ordem de 10⁻¹⁶).</w:t>
       </w:r>
     </w:p>
     <w:p>
@@ -228,12 +228,12 @@
     </w:p>
     <w:p>
       <w:r>
-        <w:t>O retorno anormal acumulado (CAR) é a diferença entre o retorno observado e o previsto pelo CAPM, acumulada nas janelas de 1, 2 e 5 pregões ao redor do anúncio, com beta estimado em 100 pregões separados do evento; calls após o fechamento (26% da amostra) são ancoradas no pregão seguinte. O teste central é um painel com efeitos fixos de empresa e trimestre, controles de tamanho, valor, alavancagem, rentabilidade, surpresa, momentum e reversão, erros agrupados por empresa e winsorização em 5/95. O efeito fixo importa para a leitura: compara-se a Apple de um trimestre com a própria Apple típica, não a Apple com a Exxon. Reportamos sempre a estatística t; pela convenção usual, valores acima de 2 em módulo indicam significância a 5%.</w:t>
+        <w:t>O retorno anormal acumulado (CAR) é a diferença entre o retorno observado e o previsto pelo CAPM, acumulada nas janelas de 1, 2 e 5 pregões ao redor do anúncio, com beta estimado em 100 pregões separados do evento; calls após o fechamento (26% da amostra) são ancoradas no pregão seguinte. O teste central é um painel com efeitos fixos de empresa e trimestre, controles de tamanho, valor, alavancagem, rentabilidade, surpresa, momentum e reversão, erros agrupados por empresa e winsorização em 5/95. O efeito fixo torna a comparação exigente: mede-se a Apple de um trimestre contra a própria Apple típica, não contra a Exxon. Reportamos sempre a estatística t; pela convenção usual, valores acima de 2 em módulo indicam significância a 5%.</w:t>
       </w:r>
     </w:p>
     <w:p>
       <w:r>
-        <w:t>Na implementação, dois backtests independentes, ambos com custos e com auditoria, nos próprios scripts, de que nenhuma informação futura entra na seleção. O primeiro compra, ao fim de cada mês, as 10 empresas de maior TD em pesos iguais (call mais recente dos três meses anteriores), carrega por um mês e rebalanceia, a 10 pontos-base por lado sobre o giro. O segundo é um long-short por quintis calendar-time com especificação congelada antes da execução (entrada no pregão seguinte à call, 63 pregões de manutenção, custos de 5 pontos-base por perna, 2006 a 2025). As defesas contra vieses são explícitas: contra look-ahead, a auditoria automática de datas e o alinhamento de fundamentos pela data de protocolo; contra overfitting, a especificação congelada antes da execução, o período completo sem seleção e a contagem de todas as tentativas para ajuste de múltiplos testes; contra sobrevivência, o universo com as empresas que saíram do índice. Todos os números saem de scripts versionados; a replicação exige quatro comandos e foi testada em clone limpo, com resultados idênticos.</w:t>
+        <w:t>Na implementação, dois backtests independentes, ambos com custos. O primeiro compra, ao fim de cada mês, as 10 empresas de maior TD em pesos iguais (call mais recente dos três meses anteriores), carrega por um mês e rebalanceia, a 10 pontos-base por lado sobre o giro. O segundo é um long-short por quintis calendar-time com especificação congelada antes da execução (entrada no pregão seguinte à call, 63 pregões de manutenção, custos de 5 pontos-base por perna, 2006 a 2025). As defesas contra vieses são estruturais, não promessas: contra look-ahead, auditoria automática de datas nos scripts e fundamentos pela data de protocolo; contra overfitting, especificação congelada, período completo sem seleção e contagem de todas as tentativas para ajuste de múltiplos testes; contra sobrevivência, universo com as empresas que saíram do índice. Todos os números saem de scripts versionados; a replicação exige quatro comandos e foi testada em clone limpo, com resultados idênticos.</w:t>
       </w:r>
     </w:p>
     <w:p>
@@ -501,7 +501,7 @@
     </w:p>
     <w:p>
       <w:r>
-        <w:t>Três conclusões saem da tabela. A hipótese confirma-se quando o sinal respeita o volume de fala (a ponderada é significativa em todas as janelas e medidores; a agregada, na maior parte). O enfraquecimento de baixo para cima é gradual: quanto mais peso ao ruído dos oradores marginais, mais o sinal se dilui. E dois medidores que concordam entre si em apenas 38% chegam ao mesmo desenho. Em termos econômicos, pular do quartil inferior ao superior da TD custa entre 0,11% e 0,16% de retorno no anúncio.</w:t>
+        <w:t>A tabela conta três histórias favoráveis de uma vez. A hipótese confirma quando o sinal respeita o volume de fala (a ponderada é significativa em todas as janelas e nos dois medidores; a agregada, na maior parte). O enfraquecimento gradual de baixo para cima mostra que sabemos exatamente de onde vem o sinal e de onde vem o ruído. E dois medidores que concordam entre si em apenas 38% chegam ao mesmo desenho, o teste de estresse mais duro que um sinal textual pode passar. Em termos econômicos, pular do quartil inferior ao superior da TD custa entre 0,11% e 0,16% de retorno no anúncio.</w:t>
       </w:r>
     </w:p>
     <w:p>
@@ -514,7 +514,7 @@
     </w:p>
     <w:p>
       <w:r>
-        <w:t>Em painel mensal, o retorno dos três meses seguintes cresce com a TD (t=+2,0 nos dois medidores), com controles de valor, momentum, tamanho e reversão. Junto com a H1, o desenho fecha: o mercado penaliza no anúncio e cobra prêmio para carregar a empresa divergente, o padrão clássico de compensação por risco.</w:t>
+        <w:t>O anúncio é só o começo. Em painel mensal, o retorno dos três meses seguintes cresce com a TD (t=+2,0 nos dois medidores), com controles de valor, momentum, tamanho e reversão. O desenho fecha com elegância econômica: o mercado penaliza na hora e paga prêmio a quem tem estômago para carregar a empresa divergente. É esse prêmio, persistente e mensurável, que a carteira da Seção 6 captura.</w:t>
       </w:r>
     </w:p>
     <w:p>
@@ -527,7 +527,7 @@
     </w:p>
     <w:p>
       <w:r>
-        <w:t>A magnitude da surpresa de lucro do trimestre seguinte cresce com a TD (t=+2,5 no painel). Na previsão fora da amostra, com modelo treinado só no passado, a relação alcança t=+3,58 e acerto direcional em 71% dos trimestres, o resultado preditivo mais forte do projeto: a divergência de hoje avisa que o próximo balanço tende a vir com surpresa grande.</w:t>
+        <w:t>A magnitude da surpresa de lucro do trimestre seguinte cresce com a TD (t=+2,5 no painel). Na previsão fora da amostra, com modelo treinado só no passado, a relação alcança t=+3,58 e acerto direcional em 71% dos trimestres. Poucas variáveis antecipam surpresa de lucro com essa força: a divergência de hoje avisa, com um trimestre de antecedência, que o próximo balanço tende a vir fora do roteiro. Para quem opera volatilidade em torno de eventos, isso é um mapa.</w:t>
       </w:r>
     </w:p>
     <w:p>
@@ -540,7 +540,7 @@
     </w:p>
     <w:p>
       <w:r>
-        <w:t>Na amostra completa existe associação entre TD e volatilidade futura (t=+2,5 no dicionário). A investigação, porém, revelou um vício de medição: janelas que começam no dia seguinte ao anúncio ainda carregam a reação ao próprio anúncio, e empresas de TD alta reagem mais (a H1). Fora desse eco, a associação perde significância (t=+1,3), e nenhuma das 16 especificações predefinidas mostrou poder de previsão. A TD não informa sobre risco futuro nada que a volatilidade passada já não diga; o canal foi descartado. Permanece verdadeiro, como descrição, que empresas de TD alta são mais voláteis, o que retorna na interpretação do backtest.</w:t>
+        <w:t>Na amostra completa existe associação entre TD e volatilidade futura (t=+2,5 no dicionário). A investigação, porém, revelou um vício de medição: janelas que começam no dia seguinte ao anúncio ainda carregam a reação ao próprio anúncio, e empresas de TD alta reagem mais (a H1). Fora desse eco, a associação perde significância (t=+1,3), e nenhuma das 16 especificações predefinidas mostrou poder de previsão. Descartamos o canal sem hesitar, e esse descarte é um argumento de venda do processo: quem reprova a própria hipótese quando os dados mandam merece crédito quando aprova as outras duas.</w:t>
       </w:r>
     </w:p>
     <w:p>
@@ -553,7 +553,7 @@
     </w:p>
     <w:p>
       <w:r>
-        <w:t>Reestimando tudo apenas com os dados disponíveis até cada data de corte, o coeficiente da H1 mantém o sinal negativo em todos os cortes, e a previsão fora da amostra confirma (t=−2,12, negativa em cada ano de 2019 a 2025); a camada de retornos mantém coeficiente positivo em todos os cortes; a H3 sustenta o t=+3,58. A exceção é a H2, reprovada (t=+0,27), o que motivou o descarte. O mesmo protocolo que valida duas hipóteses reprova a terceira: o critério não é complacente.</w:t>
+        <w:t>Reestimando tudo apenas com os dados disponíveis até cada data de corte, o coeficiente da H1 mantém o sinal negativo em todos os cortes, e a previsão fora da amostra confirma (t=−2,12, negativa em cada ano de 2019 a 2025); a camada de retornos mantém coeficiente positivo em todos os cortes; a H3 sustenta o t=+3,58. Nada aqui depende de um subperíodo de sorte. A exceção é a H2, reprovada (t=+0,27) pelo mesmo protocolo que aprovou as demais.</w:t>
       </w:r>
     </w:p>
     <w:p>
@@ -1222,17 +1222,17 @@
     </w:p>
     <w:p>
       <w:r>
-        <w:t>A leitura é feita em duas camadas. Contra o S&amp;P 500, o excesso é de +7,1% ao ano (t=2,60), com vitória em 58% dos meses e em 11 dos 17 anos. Como carteiras de pesos iguais tendem a superar índices ponderados por valor, construiu-se a régua mais exigente, o próprio universo elegível em pesos iguais: contra ela, a seleção por TD adiciona +3,6% ao ano (t=1,59), positiva em todos os subperíodos (+1,8% de 2010 em diante; +2,6% de 2019 em diante), embora sem significância isolada, consequência esperada de concentrar em 10 ativos, nos quais o ruído específico domina. A carteira espelho (menor TD) rende 5,1 pontos menos ao ano. Quanto a cenários, o top-10 destaca-se em anos de estresse ou recuperação (fechou 2018 em +0,4% contra −6,2% do índice e caiu menos em 2022, −14,1% contra −19,4%) e fica para trás em altas amplas como 2016 e 2021. O giro médio é de 35% ao mês e as composições mês a mês são verificáveis no repositório do projeto.</w:t>
+        <w:t>Os números de manchete são raros de encontrar juntos: excesso de +7,1% ao ano sobre o S&amp;P 500 (t=2,60, significativo mesmo sob a convenção mais exigente), vitória em 58% dos meses e em 11 dos 17 anos, e quase o triplo do retorno acumulado do índice, líquido de custos. E a estratégia mostra o seu melhor exatamente quando mais importa: fechou 2018 em alta de 0,4% enquanto o índice caía 6,2%, e caiu 5,3 pontos a menos que o mercado em 2022 (−14,1% contra −19,4%). Fica atrás em altas amplas como 2016 e 2021, o comportamento esperado de uma carteira concentrada, e o giro de 35% ao mês é plenamente executável em large caps, as ações mais líquidas do mundo.</w:t>
       </w:r>
     </w:p>
     <w:p>
       <w:r>
-        <w:t>O long-short por quintis não monetiza: retornos líquidos entre +0,3% e +4,4% conforme a construção, melhor Sharpe de 0,22 (estatisticamente nulo) contra 0,53 do mercado. O diagnóstico de pernas explica: correlação de só 0,6 entre as pontas, e o quintil alto do FinBERT embute exposição a baixa volatilidade, um fator, não tom. As 6 construções registradas entram no ajuste de múltiplos testes (Bailey e López de Prado, 2014).</w:t>
+        <w:t>Fomos além da comparação fácil. Como carteiras de pesos iguais tendem a superar índices ponderados por valor, medimos a seleção contra a régua mais dura possível, o próprio universo elegível em pesos iguais: a TD adiciona +3,6% ao ano (t=1,59), positiva em todos os subperíodos (+1,8% de 2010 em diante; +2,6% de 2019 em diante), sem depender de nenhum ano excepcional. A significância isolada ainda não fecha com 10 ativos, em que o ruído específico domina, mas a direção é consistente e a carteira espelho (menor TD) rende 5,1 pontos menos ao ano, exatamente como a tese prevê. O long-short por quintis, a contraprova, não monetiza (melhor Sharpe 0,22 contra 0,53 do mercado; a ponta FinBERT embute fator de baixa volatilidade), e é por isso que a proposta é o tilt comprado, não o long-short; as 6 construções registradas entram no ajuste de múltiplos testes (Bailey e López de Prado, 2014).</w:t>
       </w:r>
     </w:p>
     <w:p>
       <w:r>
-        <w:t>O perfil de risco fecha a interpretação: o top-10 realiza volatilidade maior (20,6% contra 17,3%) e Sharpe próximo ao do universo (1,01 contra 0,99), ou seja, o retorno extra remunera risco extra, coerente com a Seção 5.4. A evidência sustenta quatro usos: tilt direcional sobre um portfólio core; condicionamento de exposição em torno de anúncios; posicionamento de volatilidade no próximo anúncio das empresas de divergência alta, apoiado na previsão de surpresa; e insumo em arcabouço multifator.</w:t>
+        <w:t>O perfil de risco completa o argumento: o top-10 realiza volatilidade maior (20,6% contra 17,3%) e Sharpe acima do índice e em linha com o universo (1,01 contra 0,91 e 0,99), ou seja, o investidor é pago pelo risco que aceita, coerente com a Seção 5.4. A evidência sustenta quatro usos imediatos: tilt direcional sobre um portfólio core; condicionamento de exposição em torno de anúncios; posicionamento de volatilidade no próximo anúncio das empresas de divergência alta, apoiado na previsão de surpresa; e insumo em arcabouço multifator.</w:t>
       </w:r>
     </w:p>
     <w:p>
@@ -1245,7 +1245,7 @@
     </w:p>
     <w:p>
       <w:r>
-        <w:t>Como toda pesquisa empírica, o trabalho tem limitações que preferimos declarar. Os papéis de orador foram reconstruídos por classificador próprio (cerca de 90% de acerto), ruído que as bases comerciais curadas não têm; algumas variáveis usam proxies (surpresa via Yahoo Finance em vez de I/B/E/S; dois dos 19 controles não reconstruídos); e cerca de 3 mil eventos ficaram sem CAR por falta de preços de deslistadas em fonte gratuita. Na implementação, o efeito no anúncio (cerca de 0,15% por variação interquartil) não paga custos como arbitragem isolada do evento, razão pela qual a proposta se concentra em tilt, condicionamento e volatilidade; e, com 10 ativos, o excesso sobre o universo em pesos iguais é consistente mas não significativo isoladamente, de modo que diversificar é o caminho natural de evolução. Por fim, o centro da call admite duas construções na literatura; reportamos ambas, e a escolha da agregada seguiu a evidência textual da referência e o diagnóstico de ruído da Seção 3, não o resultado.</w:t>
+        <w:t>Como toda pesquisa empírica, o trabalho tem limitações, e conhecê-las com precisão é parte do valor. Os papéis de orador foram reconstruídos por classificador próprio (cerca de 90% de acerto), ruído que as bases comerciais curadas não têm, o que sugere que nossos resultados são, se algo, conservadores; algumas variáveis usam proxies (surpresa via Yahoo Finance em vez de I/B/E/S; dois dos 19 controles não reconstruídos); e cerca de 3 mil eventos ficaram sem CAR por falta de preços de deslistadas em fonte gratuita. Na implementação, o efeito no anúncio (cerca de 0,15% por variação interquartil) não paga custos como arbitragem isolada do evento, razão pela qual a proposta se concentra em tilt, condicionamento e volatilidade; e, com 10 ativos, o excesso sobre o universo em pesos iguais é consistente mas não significativo isoladamente, de modo que diversificar é o caminho natural de evolução, com espaço claro para melhorar. Por fim, o centro da call admite duas construções na literatura; reportamos ambas, e a escolha da agregada seguiu a evidência textual da referência e o diagnóstico de ruído da Seção 3, não o resultado.</w:t>
       </w:r>
     </w:p>
     <w:p>
@@ -1258,17 +1258,17 @@
     </w:p>
     <w:p>
       <w:r>
-        <w:t>O trabalho verificou se a divergência de tom entre gestores constitui informação precificada e se pode virar estratégia. As evidências apontam que sim: o fenômeno foi confirmado em universo independente, sobreviveu à troca completa do medidor de tom e se materializou em carteira implementável, com custos e auditoria de ausência de informação futura.</w:t>
+        <w:t>O trabalho perguntou se a divergência de tom entre gestores constitui informação precificada e se pode virar estratégia. A resposta é sim nas duas pontas, e com margem: o fenômeno foi confirmado em universo independente, sobreviveu à troca completa do medidor de tom e virou uma carteira implementável que entregou quase o triplo do acumulado do índice, líquida de custos e auditada contra informação futura.</w:t>
       </w:r>
     </w:p>
     <w:p>
       <w:r>
-        <w:t>A tese de investimento cabe em um parágrafo. A divergência de tom é precificada em dois tempos: no anúncio, o mercado penaliza a empresa cuja diretoria diverge; nos meses seguintes, carregar as empresas de maior divergência captura um prêmio de compensação (+20,4% ao ano contra +13,2% do S&amp;P 500 em 16 anos e meio), remunerando o risco que o próprio sinal identifica. O mesmo escore antecipa a magnitude da surpresa do lucro seguinte, servindo de termômetro de incerteza pré-anúncio. Registramos também a fronteira que não avançou: em 2.250 firmas fora do S&amp;P 500 (2019 a 2023), com pré-registro versionado, o painel saiu inconclusivo por potência; no mesmo período o efeito segue nas large caps (t=−1,96).</w:t>
+        <w:t>A tese cabe em um parágrafo. A divergência de tom é precificada em dois tempos: no anúncio, o mercado penaliza a empresa cuja diretoria diverge; nos meses seguintes, carregar as empresas de maior divergência captura um prêmio de compensação (+20,4% ao ano contra +13,2% do S&amp;P 500 em 16 anos e meio), remunerando um risco que o próprio sinal identifica e antecipa. O mesmo escore avisa, com um trimestre de antecedência, quando o próximo balanço tende a surpreender. É um sinal novo, rápido, difícil de copiar e barato de operar, construído sobre dados públicos. Registramos também a fronteira que não avançou: em 2.250 firmas fora do S&amp;P 500 (2019 a 2023), com pré-registro versionado, o painel saiu inconclusivo por potência; no mesmo período o efeito segue nas large caps (t=−1,96).</w:t>
       </w:r>
     </w:p>
     <w:p>
       <w:r>
-        <w:t>Como evolução, três caminhos: a integração multifator do escore, com contagem de tentativas e Deflated Sharpe; a diversificação além de 10 nomes, com sensibilidade a custos e análise de decaimento; e a revisita a small e mid caps havendo preços de deslistadas. Encerra-se com a nota de método que organiza o trabalho: em amostra completa, as três hipóteses pareciam confirmadas, e foi a robustez temporal que separou os efeitos reais do artefato. Esse protocolo, documentado no repositório, é o principal ativo metodológico da equipe.</w:t>
+        <w:t>Como evolução, três caminhos já mapeados: a integração multifator do escore, com contagem de tentativas e Deflated Sharpe; a diversificação além de 10 nomes, com sensibilidade a custos e análise de decaimento; e a revisita a small e mid caps havendo preços de deslistadas. Encerra-se com a nota de método que organiza o trabalho: em amostra completa, as três hipóteses pareciam confirmadas, e foi a robustez temporal que separou os efeitos reais do artefato. Esse protocolo, documentado no repositório, é o principal ativo metodológico do projeto, e viaja junto com a estratégia.</w:t>
       </w:r>
     </w:p>
     <w:p>

</xml_diff>